<commit_message>
Updated ZOV/Cplex setup documentation
</commit_message>
<xml_diff>
--- a/zov_cplex_proj/doc/Setup for CPLEX on Bebop.docx
+++ b/zov_cplex_proj/doc/Setup for CPLEX on Bebop.docx
@@ -6,8 +6,6 @@
       <w:pPr>
         <w:pStyle w:val="Title"/>
       </w:pPr>
-      <w:bookmarkStart w:id="0" w:name="_GoBack"/>
-      <w:bookmarkEnd w:id="0"/>
       <w:r>
         <w:t xml:space="preserve">Client Side </w:t>
       </w:r>
@@ -395,19 +393,7 @@
       </w:r>
       <w:proofErr w:type="spellEnd"/>
       <w:r>
-        <w:t xml:space="preserve"> '\\wales</w:t>
-      </w:r>
-      <w:r>
-        <w:t>\</w:t>
-      </w:r>
-      <w:r>
-        <w:t>shared</w:t>
-      </w:r>
-      <w:r>
-        <w:t>'</w:t>
-      </w:r>
-      <w:r>
-        <w:t xml:space="preserve"> /</w:t>
+        <w:t xml:space="preserve"> '\\ascend.egs.anl.gov\groups\AMD-ES-Shared' /</w:t>
       </w:r>
       <w:proofErr w:type="spellStart"/>
       <w:r>
@@ -582,6 +568,276 @@
       <w:proofErr w:type="gramEnd"/>
       <w:r>
         <w:t xml:space="preserve"> -s default POLARIS</w:t>
+      </w:r>
+    </w:p>
+    <w:p>
+      <w:pPr>
+        <w:pStyle w:val="ListParagraph"/>
+      </w:pPr>
+    </w:p>
+    <w:p>
+      <w:pPr>
+        <w:pStyle w:val="Heading1"/>
+      </w:pPr>
+      <w:r>
+        <w:t>Clone Repository and Execute Scripts</w:t>
+      </w:r>
+      <w:bookmarkStart w:id="0" w:name="_GoBack"/>
+      <w:bookmarkEnd w:id="0"/>
+    </w:p>
+    <w:p>
+      <w:pPr>
+        <w:pStyle w:val="ListParagraph"/>
+      </w:pPr>
+    </w:p>
+    <w:p>
+      <w:pPr>
+        <w:pStyle w:val="ListParagraph"/>
+        <w:numPr>
+          <w:ilvl w:val="0"/>
+          <w:numId w:val="9"/>
+        </w:numPr>
+      </w:pPr>
+      <w:r>
+        <w:t xml:space="preserve">Clone the HPC project from </w:t>
+      </w:r>
+      <w:proofErr w:type="spellStart"/>
+      <w:r>
+        <w:t>git</w:t>
+      </w:r>
+      <w:proofErr w:type="spellEnd"/>
+      <w:r>
+        <w:t>. You need the client side scripts from the ZOV/</w:t>
+      </w:r>
+      <w:proofErr w:type="spellStart"/>
+      <w:r>
+        <w:t>Cplex</w:t>
+      </w:r>
+      <w:proofErr w:type="spellEnd"/>
+      <w:r>
+        <w:t xml:space="preserve"> project:</w:t>
+      </w:r>
+    </w:p>
+    <w:p>
+      <w:pPr>
+        <w:pStyle w:val="ListParagraph"/>
+      </w:pPr>
+      <w:proofErr w:type="spellStart"/>
+      <w:proofErr w:type="gramStart"/>
+      <w:r>
+        <w:t>git</w:t>
+      </w:r>
+      <w:proofErr w:type="spellEnd"/>
+      <w:proofErr w:type="gramEnd"/>
+      <w:r>
+        <w:t xml:space="preserve"> clone </w:t>
+      </w:r>
+      <w:hyperlink r:id="rId11" w:history="1">
+        <w:r>
+          <w:rPr>
+            <w:rStyle w:val="Hyperlink"/>
+          </w:rPr>
+          <w:t>https://github.com/anl-polaris/polaris-hpc.git</w:t>
+        </w:r>
+      </w:hyperlink>
+    </w:p>
+    <w:p>
+      <w:pPr>
+        <w:pStyle w:val="ListParagraph"/>
+      </w:pPr>
+    </w:p>
+    <w:p>
+      <w:pPr>
+        <w:pStyle w:val="ListParagraph"/>
+        <w:numPr>
+          <w:ilvl w:val="0"/>
+          <w:numId w:val="9"/>
+        </w:numPr>
+      </w:pPr>
+      <w:r>
+        <w:t xml:space="preserve">Navigate to the client side scripts folder and execute the script to run the </w:t>
+      </w:r>
+      <w:proofErr w:type="spellStart"/>
+      <w:r>
+        <w:t>cplex</w:t>
+      </w:r>
+      <w:proofErr w:type="spellEnd"/>
+      <w:r>
+        <w:t xml:space="preserve"> process:</w:t>
+      </w:r>
+    </w:p>
+    <w:p>
+      <w:pPr>
+        <w:pStyle w:val="ListParagraph"/>
+      </w:pPr>
+      <w:proofErr w:type="gramStart"/>
+      <w:r>
+        <w:t>cd</w:t>
+      </w:r>
+      <w:proofErr w:type="gramEnd"/>
+      <w:r>
+        <w:t xml:space="preserve"> Polaris-</w:t>
+      </w:r>
+      <w:proofErr w:type="spellStart"/>
+      <w:r>
+        <w:t>hpc</w:t>
+      </w:r>
+      <w:proofErr w:type="spellEnd"/>
+      <w:r>
+        <w:t>/</w:t>
+      </w:r>
+      <w:proofErr w:type="spellStart"/>
+      <w:r>
+        <w:t>zov_cplex_proj</w:t>
+      </w:r>
+      <w:proofErr w:type="spellEnd"/>
+      <w:r>
+        <w:t>/</w:t>
+      </w:r>
+      <w:proofErr w:type="spellStart"/>
+      <w:r>
+        <w:t>client_side_scripts</w:t>
+      </w:r>
+      <w:proofErr w:type="spellEnd"/>
+    </w:p>
+    <w:p>
+      <w:pPr>
+        <w:pStyle w:val="ListParagraph"/>
+      </w:pPr>
+      <w:r>
+        <w:t>./run_cplex.sh &lt;path to base directory&gt;</w:t>
+      </w:r>
+    </w:p>
+    <w:p>
+      <w:pPr>
+        <w:pStyle w:val="ListParagraph"/>
+      </w:pPr>
+    </w:p>
+    <w:p>
+      <w:pPr>
+        <w:pStyle w:val="ListParagraph"/>
+      </w:pPr>
+      <w:r>
+        <w:t>Example:</w:t>
+      </w:r>
+    </w:p>
+    <w:p>
+      <w:pPr>
+        <w:pStyle w:val="ListParagraph"/>
+      </w:pPr>
+      <w:r>
+        <w:t>./run_cplex.sh /</w:t>
+      </w:r>
+      <w:proofErr w:type="spellStart"/>
+      <w:r>
+        <w:t>mnt</w:t>
+      </w:r>
+      <w:proofErr w:type="spellEnd"/>
+      <w:r>
+        <w:t>/h/POLARIS/</w:t>
+      </w:r>
+      <w:proofErr w:type="spellStart"/>
+      <w:r>
+        <w:t>Scenario_C_EVIPRO</w:t>
+      </w:r>
+      <w:proofErr w:type="spellEnd"/>
+      <w:r>
+        <w:t>/</w:t>
+      </w:r>
+      <w:proofErr w:type="spellStart"/>
+      <w:r>
+        <w:t>chicago_C_highT</w:t>
+      </w:r>
+      <w:proofErr w:type="spellEnd"/>
+    </w:p>
+    <w:p>
+      <w:pPr>
+        <w:pStyle w:val="ListParagraph"/>
+      </w:pPr>
+    </w:p>
+    <w:p>
+      <w:pPr>
+        <w:pStyle w:val="ListParagraph"/>
+      </w:pPr>
+      <w:r>
+        <w:t>This will manipulate the files in the ZOV folder under the base directory and create the following directory structure:</w:t>
+      </w:r>
+    </w:p>
+    <w:p>
+      <w:pPr>
+        <w:pStyle w:val="ListParagraph"/>
+      </w:pPr>
+      <w:r>
+        <w:t>/</w:t>
+      </w:r>
+      <w:proofErr w:type="spellStart"/>
+      <w:r>
+        <w:t>mnt</w:t>
+      </w:r>
+      <w:proofErr w:type="spellEnd"/>
+      <w:r>
+        <w:t>/h/POLARIS/</w:t>
+      </w:r>
+      <w:proofErr w:type="spellStart"/>
+      <w:r>
+        <w:t>Scenario_C_EVIPRO</w:t>
+      </w:r>
+      <w:proofErr w:type="spellEnd"/>
+      <w:r>
+        <w:t>/</w:t>
+      </w:r>
+      <w:proofErr w:type="spellStart"/>
+      <w:r>
+        <w:t>chicago_C_highT</w:t>
+      </w:r>
+      <w:proofErr w:type="spellEnd"/>
+    </w:p>
+    <w:p>
+      <w:pPr>
+        <w:pStyle w:val="ListParagraph"/>
+        <w:numPr>
+          <w:ilvl w:val="3"/>
+          <w:numId w:val="2"/>
+        </w:numPr>
+      </w:pPr>
+      <w:r>
+        <w:t>run_&lt;timestamp&gt;</w:t>
+      </w:r>
+    </w:p>
+    <w:p>
+      <w:pPr>
+        <w:pStyle w:val="ListParagraph"/>
+        <w:ind w:left="3600"/>
+      </w:pPr>
+      <w:proofErr w:type="gramStart"/>
+      <w:r>
+        <w:t>inputs</w:t>
+      </w:r>
+      <w:proofErr w:type="gramEnd"/>
+    </w:p>
+    <w:p>
+      <w:pPr>
+        <w:pStyle w:val="ListParagraph"/>
+        <w:ind w:left="3600"/>
+      </w:pPr>
+      <w:proofErr w:type="gramStart"/>
+      <w:r>
+        <w:t>results</w:t>
+      </w:r>
+      <w:proofErr w:type="gramEnd"/>
+    </w:p>
+    <w:p>
+      <w:pPr>
+        <w:pStyle w:val="ListParagraph"/>
+        <w:ind w:left="3600"/>
+      </w:pPr>
+    </w:p>
+    <w:p>
+      <w:pPr>
+        <w:pStyle w:val="ListParagraph"/>
+      </w:pPr>
+      <w:r>
+        <w:t>When the script finishes you will have the results you need in the results folder</w:t>
       </w:r>
     </w:p>
     <w:sectPr>
@@ -599,7 +855,7 @@
   <w:abstractNum w:abstractNumId="0" w15:restartNumberingAfterBreak="0">
     <w:nsid w:val="0977402F"/>
     <w:multiLevelType w:val="hybridMultilevel"/>
-    <w:tmpl w:val="0586450A"/>
+    <w:tmpl w:val="18FE2D8C"/>
     <w:lvl w:ilvl="0" w:tplc="0409000F">
       <w:start w:val="1"/>
       <w:numFmt w:val="decimal"/>
@@ -627,14 +883,16 @@
         <w:ind w:left="2160" w:hanging="180"/>
       </w:pPr>
     </w:lvl>
-    <w:lvl w:ilvl="3" w:tplc="0409000F" w:tentative="1">
-      <w:start w:val="1"/>
-      <w:numFmt w:val="decimal"/>
-      <w:lvlText w:val="%4."/>
+    <w:lvl w:ilvl="3" w:tplc="E3A49022">
+      <w:numFmt w:val="bullet"/>
+      <w:lvlText w:val="-"/>
       <w:lvlJc w:val="left"/>
       <w:pPr>
         <w:ind w:left="2880" w:hanging="360"/>
       </w:pPr>
+      <w:rPr>
+        <w:rFonts w:ascii="Calibri" w:eastAsiaTheme="minorHAnsi" w:hAnsi="Calibri" w:cs="Calibri" w:hint="default"/>
+      </w:rPr>
     </w:lvl>
     <w:lvl w:ilvl="4" w:tplc="04090019" w:tentative="1">
       <w:start w:val="1"/>
@@ -884,7 +1142,7 @@
   <w:abstractNum w:abstractNumId="3" w15:restartNumberingAfterBreak="0">
     <w:nsid w:val="3BD170B4"/>
     <w:multiLevelType w:val="hybridMultilevel"/>
-    <w:tmpl w:val="B1AA49AC"/>
+    <w:tmpl w:val="551A2E88"/>
     <w:lvl w:ilvl="0" w:tplc="0409000F">
       <w:start w:val="1"/>
       <w:numFmt w:val="decimal"/>
@@ -968,6 +1226,92 @@
     </w:lvl>
   </w:abstractNum>
   <w:abstractNum w:abstractNumId="4" w15:restartNumberingAfterBreak="0">
+    <w:nsid w:val="3F492293"/>
+    <w:multiLevelType w:val="hybridMultilevel"/>
+    <w:tmpl w:val="551A2E88"/>
+    <w:lvl w:ilvl="0" w:tplc="0409000F">
+      <w:start w:val="1"/>
+      <w:numFmt w:val="decimal"/>
+      <w:lvlText w:val="%1."/>
+      <w:lvlJc w:val="left"/>
+      <w:pPr>
+        <w:ind w:left="720" w:hanging="360"/>
+      </w:pPr>
+    </w:lvl>
+    <w:lvl w:ilvl="1" w:tplc="04090019">
+      <w:start w:val="1"/>
+      <w:numFmt w:val="lowerLetter"/>
+      <w:lvlText w:val="%2."/>
+      <w:lvlJc w:val="left"/>
+      <w:pPr>
+        <w:ind w:left="1440" w:hanging="360"/>
+      </w:pPr>
+    </w:lvl>
+    <w:lvl w:ilvl="2" w:tplc="0409001B">
+      <w:start w:val="1"/>
+      <w:numFmt w:val="lowerRoman"/>
+      <w:lvlText w:val="%3."/>
+      <w:lvlJc w:val="right"/>
+      <w:pPr>
+        <w:ind w:left="2160" w:hanging="180"/>
+      </w:pPr>
+    </w:lvl>
+    <w:lvl w:ilvl="3" w:tplc="0409000F" w:tentative="1">
+      <w:start w:val="1"/>
+      <w:numFmt w:val="decimal"/>
+      <w:lvlText w:val="%4."/>
+      <w:lvlJc w:val="left"/>
+      <w:pPr>
+        <w:ind w:left="2880" w:hanging="360"/>
+      </w:pPr>
+    </w:lvl>
+    <w:lvl w:ilvl="4" w:tplc="04090019" w:tentative="1">
+      <w:start w:val="1"/>
+      <w:numFmt w:val="lowerLetter"/>
+      <w:lvlText w:val="%5."/>
+      <w:lvlJc w:val="left"/>
+      <w:pPr>
+        <w:ind w:left="3600" w:hanging="360"/>
+      </w:pPr>
+    </w:lvl>
+    <w:lvl w:ilvl="5" w:tplc="0409001B" w:tentative="1">
+      <w:start w:val="1"/>
+      <w:numFmt w:val="lowerRoman"/>
+      <w:lvlText w:val="%6."/>
+      <w:lvlJc w:val="right"/>
+      <w:pPr>
+        <w:ind w:left="4320" w:hanging="180"/>
+      </w:pPr>
+    </w:lvl>
+    <w:lvl w:ilvl="6" w:tplc="0409000F" w:tentative="1">
+      <w:start w:val="1"/>
+      <w:numFmt w:val="decimal"/>
+      <w:lvlText w:val="%7."/>
+      <w:lvlJc w:val="left"/>
+      <w:pPr>
+        <w:ind w:left="5040" w:hanging="360"/>
+      </w:pPr>
+    </w:lvl>
+    <w:lvl w:ilvl="7" w:tplc="04090019" w:tentative="1">
+      <w:start w:val="1"/>
+      <w:numFmt w:val="lowerLetter"/>
+      <w:lvlText w:val="%8."/>
+      <w:lvlJc w:val="left"/>
+      <w:pPr>
+        <w:ind w:left="5760" w:hanging="360"/>
+      </w:pPr>
+    </w:lvl>
+    <w:lvl w:ilvl="8" w:tplc="0409001B" w:tentative="1">
+      <w:start w:val="1"/>
+      <w:numFmt w:val="lowerRoman"/>
+      <w:lvlText w:val="%9."/>
+      <w:lvlJc w:val="right"/>
+      <w:pPr>
+        <w:ind w:left="6480" w:hanging="180"/>
+      </w:pPr>
+    </w:lvl>
+  </w:abstractNum>
+  <w:abstractNum w:abstractNumId="5" w15:restartNumberingAfterBreak="0">
     <w:nsid w:val="46963B59"/>
     <w:multiLevelType w:val="hybridMultilevel"/>
     <w:tmpl w:val="2DCAF098"/>
@@ -1079,7 +1423,7 @@
       </w:rPr>
     </w:lvl>
   </w:abstractNum>
-  <w:abstractNum w:abstractNumId="5" w15:restartNumberingAfterBreak="0">
+  <w:abstractNum w:abstractNumId="6" w15:restartNumberingAfterBreak="0">
     <w:nsid w:val="4D2678D5"/>
     <w:multiLevelType w:val="hybridMultilevel"/>
     <w:tmpl w:val="CC2678F0"/>
@@ -1192,7 +1536,7 @@
       </w:rPr>
     </w:lvl>
   </w:abstractNum>
-  <w:abstractNum w:abstractNumId="6" w15:restartNumberingAfterBreak="0">
+  <w:abstractNum w:abstractNumId="7" w15:restartNumberingAfterBreak="0">
     <w:nsid w:val="53A656D1"/>
     <w:multiLevelType w:val="hybridMultilevel"/>
     <w:tmpl w:val="A874E480"/>
@@ -1278,7 +1622,7 @@
       </w:pPr>
     </w:lvl>
   </w:abstractNum>
-  <w:abstractNum w:abstractNumId="7" w15:restartNumberingAfterBreak="0">
+  <w:abstractNum w:abstractNumId="8" w15:restartNumberingAfterBreak="0">
     <w:nsid w:val="596553C4"/>
     <w:multiLevelType w:val="hybridMultilevel"/>
     <w:tmpl w:val="8498612E"/>
@@ -1392,13 +1736,13 @@
     </w:lvl>
   </w:abstractNum>
   <w:num w:numId="1">
-    <w:abstractNumId w:val="4"/>
+    <w:abstractNumId w:val="5"/>
   </w:num>
   <w:num w:numId="2">
     <w:abstractNumId w:val="0"/>
   </w:num>
   <w:num w:numId="3">
-    <w:abstractNumId w:val="6"/>
+    <w:abstractNumId w:val="7"/>
   </w:num>
   <w:num w:numId="4">
     <w:abstractNumId w:val="2"/>
@@ -1407,13 +1751,16 @@
     <w:abstractNumId w:val="1"/>
   </w:num>
   <w:num w:numId="6">
-    <w:abstractNumId w:val="5"/>
+    <w:abstractNumId w:val="6"/>
   </w:num>
   <w:num w:numId="7">
-    <w:abstractNumId w:val="7"/>
+    <w:abstractNumId w:val="8"/>
   </w:num>
   <w:num w:numId="8">
     <w:abstractNumId w:val="3"/>
+  </w:num>
+  <w:num w:numId="9">
+    <w:abstractNumId w:val="4"/>
   </w:num>
 </w:numbering>
 </file>

</xml_diff>